<commit_message>
Ajout lien video demo YouTube dans README et dossier
</commit_message>
<xml_diff>
--- a/Dossier_Projet_RNCP38777_Bloc3_Codron.docx
+++ b/Dossier_Projet_RNCP38777_Bloc3_Codron.docx
@@ -6393,7 +6393,65 @@
           <w:color w:val="14A085"/>
           <w:sz w:val="30"/>
         </w:rPr>
-        <w:t>A.3 URLs des interfaces</w:t>
+        <w:t>A.3 Demonstration video</w:t>
+      </w:r>
+    </w:p>
+    <w:p>
+      <w:pPr>
+        <w:spacing w:after="120" w:line="240" w:lineRule="auto"/>
+      </w:pPr>
+      <w:r>
+        <w:rPr>
+          <w:rFonts w:ascii="Calibri" w:hAnsi="Calibri"/>
+          <w:b w:val="0"/>
+          <w:i w:val="0"/>
+          <w:color w:val="222B3D"/>
+          <w:sz w:val="22"/>
+        </w:rPr>
+        <w:t>Une demonstration video de l'infrastructure en production est disponible (non repertoriee, accessible par lien direct uniquement) :</w:t>
+      </w:r>
+    </w:p>
+    <w:p>
+      <w:pPr>
+        <w:spacing w:after="160"/>
+      </w:pPr>
+      <w:r>
+        <w:rPr>
+          <w:rFonts w:ascii="Calibri" w:hAnsi="Calibri"/>
+          <w:b/>
+          <w:color w:val="14A085"/>
+          <w:sz w:val="24"/>
+        </w:rPr>
+        <w:t>https://youtu.be/DLZHrRfsCUQ</w:t>
+      </w:r>
+    </w:p>
+    <w:p>
+      <w:pPr>
+        <w:spacing w:after="120" w:line="240" w:lineRule="auto"/>
+      </w:pPr>
+      <w:r>
+        <w:rPr>
+          <w:rFonts w:ascii="Calibri" w:hAnsi="Calibri"/>
+          <w:b w:val="0"/>
+          <w:i/>
+          <w:color w:val="6B7787"/>
+          <w:sz w:val="20"/>
+        </w:rPr>
+        <w:t>Contenu de la video : architecture du pipeline, demonstration du flux Kafka, dashboard temps reel avec performance live du modele, requete des fraudes detectees en base.</w:t>
+      </w:r>
+    </w:p>
+    <w:p>
+      <w:pPr>
+        <w:pStyle w:val="Heading2"/>
+      </w:pPr>
+      <w:r>
+        <w:rPr>
+          <w:rFonts w:ascii="Calibri" w:hAnsi="Calibri"/>
+          <w:b/>
+          <w:color w:val="14A085"/>
+          <w:sz w:val="30"/>
+        </w:rPr>
+        <w:t>A.4 URLs des interfaces</w:t>
       </w:r>
     </w:p>
     <w:tbl>
@@ -6923,7 +6981,7 @@
           <w:color w:val="14A085"/>
           <w:sz w:val="30"/>
         </w:rPr>
-        <w:t>A.4 References</w:t>
+        <w:t>A.5 References</w:t>
       </w:r>
     </w:p>
     <w:p>

</xml_diff>